<commit_message>
Update EverLeaf tools and technology documentation
</commit_message>
<xml_diff>
--- a/documentation/EverLeaf-Project-Documentation.docx
+++ b/documentation/EverLeaf-Project-Documentation.docx
@@ -299,6 +299,41 @@
               <w:spacing w:line="240" w:lineRule="auto" w:after="0"/>
             </w:pPr>
             <w:r>
+              <w:t>HTML, CSS, and JavaScript</w:t>
+            </w:r>
+          </w:p>
+        </w:tc>
+        <w:tc>
+          <w:tcPr>
+            <w:tcW w:type="dxa" w:w="5832"/>
+            <w:vAlign w:val="center"/>
+          </w:tcPr>
+          <w:p>
+            <w:pPr>
+              <w:keepLines/>
+              <w:spacing w:line="240" w:lineRule="auto" w:after="0"/>
+            </w:pPr>
+            <w:r>
+              <w:t>Markup, styling, and browser/runtime language technologies used by the application.</w:t>
+            </w:r>
+          </w:p>
+        </w:tc>
+      </w:tr>
+      <w:tr>
+        <w:trPr>
+          <w:cantSplit/>
+        </w:trPr>
+        <w:tc>
+          <w:tcPr>
+            <w:tcW w:type="dxa" w:w="3096"/>
+            <w:vAlign w:val="center"/>
+          </w:tcPr>
+          <w:p>
+            <w:pPr>
+              <w:keepLines/>
+              <w:spacing w:line="240" w:lineRule="auto" w:after="0"/>
+            </w:pPr>
+            <w:r>
               <w:t>PostCSS with @tailwindcss/postcss 4.3.3</w:t>
             </w:r>
           </w:p>
@@ -437,7 +472,7 @@
               <w:spacing w:line="240" w:lineRule="auto" w:after="0"/>
             </w:pPr>
             <w:r>
-              <w:t>Next.js server features and Server Actions 16.3.8</w:t>
+              <w:t>Next.js Server Actions 16.3.8</w:t>
             </w:r>
           </w:p>
         </w:tc>
@@ -488,6 +523,41 @@
             </w:pPr>
             <w:r>
               <w:t>Active authentication service integration in the Next.js application; remote project settings were not inspected.</w:t>
+            </w:r>
+          </w:p>
+        </w:tc>
+      </w:tr>
+      <w:tr>
+        <w:trPr>
+          <w:cantSplit/>
+        </w:trPr>
+        <w:tc>
+          <w:tcPr>
+            <w:tcW w:type="dxa" w:w="3096"/>
+            <w:vAlign w:val="center"/>
+          </w:tcPr>
+          <w:p>
+            <w:pPr>
+              <w:keepLines/>
+              <w:spacing w:line="240" w:lineRule="auto" w:after="0"/>
+            </w:pPr>
+            <w:r>
+              <w:t>Supabase Storage</w:t>
+            </w:r>
+          </w:p>
+        </w:tc>
+        <w:tc>
+          <w:tcPr>
+            <w:tcW w:type="dxa" w:w="5832"/>
+            <w:vAlign w:val="center"/>
+          </w:tcPr>
+          <w:p>
+            <w:pPr>
+              <w:keepLines/>
+              <w:spacing w:line="240" w:lineRule="auto" w:after="0"/>
+            </w:pPr>
+            <w:r>
+              <w:t>Active image-storage integration for portfolio profile and project images; remote bucket settings were not inspected.</w:t>
             </w:r>
           </w:p>
         </w:tc>
@@ -577,7 +647,7 @@
               <w:spacing w:line="240" w:lineRule="auto" w:after="0"/>
             </w:pPr>
             <w:r>
-              <w:t>Laravel 12.69.2 and PHP 8.2+</w:t>
+              <w:t>Laravel 12.69.2 (Legacy)</w:t>
             </w:r>
           </w:p>
         </w:tc>
@@ -593,6 +663,41 @@
             </w:pPr>
             <w:r>
               <w:t>Earlier Laravel/Blade implementation retained at the repository root; not the active Next.js application backend.</w:t>
+            </w:r>
+          </w:p>
+        </w:tc>
+      </w:tr>
+      <w:tr>
+        <w:trPr>
+          <w:cantSplit/>
+        </w:trPr>
+        <w:tc>
+          <w:tcPr>
+            <w:tcW w:type="dxa" w:w="3096"/>
+            <w:vAlign w:val="center"/>
+          </w:tcPr>
+          <w:p>
+            <w:pPr>
+              <w:keepLines/>
+              <w:spacing w:line="240" w:lineRule="auto" w:after="0"/>
+            </w:pPr>
+            <w:r>
+              <w:t>PHP ^8.2 (Legacy)</w:t>
+            </w:r>
+          </w:p>
+        </w:tc>
+        <w:tc>
+          <w:tcPr>
+            <w:tcW w:type="dxa" w:w="5832"/>
+            <w:vAlign w:val="center"/>
+          </w:tcPr>
+          <w:p>
+            <w:pPr>
+              <w:keepLines/>
+              <w:spacing w:line="240" w:lineRule="auto" w:after="0"/>
+            </w:pPr>
+            <w:r>
+              <w:t>PHP requirement in the root Composer manifest for the earlier Laravel implementation; this does not establish an exact installed PHP version.</w:t>
             </w:r>
           </w:p>
         </w:tc>
@@ -751,7 +856,7 @@
               <w:spacing w:line="240" w:lineRule="auto" w:after="0"/>
             </w:pPr>
             <w:r>
-              <w:t>SQLite</w:t>
+              <w:t>SQLite (Legacy Laravel default)</w:t>
             </w:r>
           </w:p>
         </w:tc>
@@ -766,7 +871,7 @@
               <w:spacing w:line="240" w:lineRule="auto" w:after="0"/>
             </w:pPr>
             <w:r>
-              <w:t>Configured as the default local database in the legacy Laravel example configuration; not used by the active Next.js/Supabase application.</w:t>
+              <w:t>The root .env.example and config/database.php use SQLite as the legacy Laravel example default; it is not used by the active Next.js/Supabase application.</w:t>
             </w:r>
           </w:p>
         </w:tc>
@@ -786,7 +891,7 @@
               <w:spacing w:line="240" w:lineRule="auto" w:after="0"/>
             </w:pPr>
             <w:r>
-              <w:t>MySQL</w:t>
+              <w:t>MySQL (Legacy/local option)</w:t>
             </w:r>
           </w:p>
         </w:tc>
@@ -801,7 +906,7 @@
               <w:spacing w:line="240" w:lineRule="auto" w:after="0"/>
             </w:pPr>
             <w:r>
-              <w:t>Available as a legacy Laravel database connection option; no use by the active Next.js application was found.</w:t>
+              <w:t>The legacy Laravel configuration includes a MySQL connection. The project reports local use with XAMPP, but the checked-in .env.example defaults to SQLite and does not verify XAMPP use.</w:t>
             </w:r>
           </w:p>
         </w:tc>
@@ -1022,7 +1127,7 @@
               <w:spacing w:line="240" w:lineRule="auto" w:after="0"/>
             </w:pPr>
             <w:r>
-              <w:t>Node.js 24.21.0 and npm 11.19.0</w:t>
+              <w:t>Node.js and npm</w:t>
             </w:r>
           </w:p>
         </w:tc>
@@ -1037,7 +1142,42 @@
               <w:spacing w:line="240" w:lineRule="auto" w:after="0"/>
             </w:pPr>
             <w:r>
-              <w:t>Versions observed in the local audit environment; next-app/package.json does not pin these exact runtime versions.</w:t>
+              <w:t>Used to install and run the Next.js app. The project does not pin exact versions; Next.js 16.3.8 requires Node.js 20.9.0 or newer.</w:t>
+            </w:r>
+          </w:p>
+        </w:tc>
+      </w:tr>
+      <w:tr>
+        <w:trPr>
+          <w:cantSplit/>
+        </w:trPr>
+        <w:tc>
+          <w:tcPr>
+            <w:tcW w:type="dxa" w:w="3096"/>
+            <w:vAlign w:val="center"/>
+          </w:tcPr>
+          <w:p>
+            <w:pPr>
+              <w:keepLines/>
+              <w:spacing w:line="240" w:lineRule="auto" w:after="0"/>
+            </w:pPr>
+            <w:r>
+              <w:t>Visual Studio Code</w:t>
+            </w:r>
+          </w:p>
+        </w:tc>
+        <w:tc>
+          <w:tcPr>
+            <w:tcW w:type="dxa" w:w="5832"/>
+            <w:vAlign w:val="center"/>
+          </w:tcPr>
+          <w:p>
+            <w:pPr>
+              <w:keepLines/>
+              <w:spacing w:line="240" w:lineRule="auto" w:after="0"/>
+            </w:pPr>
+            <w:r>
+              <w:t>Project-reported development editor; not part of the deployed application.</w:t>
             </w:r>
           </w:p>
         </w:tc>
@@ -1127,7 +1267,7 @@
               <w:spacing w:line="240" w:lineRule="auto" w:after="0"/>
             </w:pPr>
             <w:r>
-              <w:t>Docker</w:t>
+              <w:t>XAMPP</w:t>
             </w:r>
           </w:p>
         </w:tc>
@@ -1142,7 +1282,7 @@
               <w:spacing w:line="240" w:lineRule="auto" w:after="0"/>
             </w:pPr>
             <w:r>
-              <w:t>A root-level Dockerfile builds the earlier PHP/Laravel application and its Vite assets; it is not the Next.js/Vercel deployment configuration.</w:t>
+              <w:t>Project-reported local-development tooling for MySQL/Laravel; not established by the repository configuration and not part of production hosting.</w:t>
             </w:r>
           </w:p>
         </w:tc>
@@ -1162,7 +1302,7 @@
               <w:spacing w:line="240" w:lineRule="auto" w:after="0"/>
             </w:pPr>
             <w:r>
-              <w:t>XAMPP</w:t>
+              <w:t>Docker</w:t>
             </w:r>
           </w:p>
         </w:tc>
@@ -1177,7 +1317,7 @@
               <w:spacing w:line="240" w:lineRule="auto" w:after="0"/>
             </w:pPr>
             <w:r>
-              <w:t>Not verified in the active application or repository configuration; not identified as a required production technology.</w:t>
+              <w:t>A root-level Dockerfile builds the earlier PHP/Laravel application and its Vite assets; it is not the Next.js/Vercel deployment configuration.</w:t>
             </w:r>
           </w:p>
         </w:tc>
@@ -1335,7 +1475,7 @@
               <w:spacing w:line="240" w:lineRule="auto" w:after="0"/>
             </w:pPr>
             <w:r>
-              <w:t>Render</w:t>
+              <w:t>Render (Legacy/alternative)</w:t>
             </w:r>
           </w:p>
         </w:tc>
@@ -1385,11 +1525,7 @@
         <w:spacing w:line="360" w:lineRule="auto" w:after="120"/>
       </w:pPr>
       <w:r>
-        <w:rPr>
-          <w:rFonts w:ascii="Times New Roman" w:hAnsi="Times New Roman" w:eastAsia="Times New Roman"/>
-          <w:sz w:val="22"/>
-        </w:rPr>
-        <w:t>Supabase is the managed backend platform used by the application. PostgreSQL is its relational database engine and stores portfolio records. Supabase Auth handles account sessions, while Supabase Storage is used for profile and project image files. Supabase is the database/backend provider; Vercel is the application hosting platform.</w:t>
+        <w:t>Supabase is the managed backend platform used by the application. PostgreSQL is its relational database engine and stores portfolio records. Supabase Auth handles account sessions, while Supabase Storage is used for profile and project image files. Supabase is the database/backend provider; Vercel is the application hosting platform. The earlier Laravel configuration also offers MySQL, while its checked-in example defaults to SQLite; the project reports XAMPP for local MySQL development, but that use is not established by repository configuration.</w:t>
       </w:r>
     </w:p>
     <w:p>

</xml_diff>